<commit_message>
Revise TV regularization and synchronize manuscripts
</commit_message>
<xml_diff>
--- a/docs/GRSL_Word/GRSL_paper.docx
+++ b/docs/GRSL_Word/GRSL_paper.docx
@@ -3318,47 +3318,28 @@
           </w:rPr>
           <m:t>+</m:t>
         </m:r>
-        <m:r>
-          <w:rPr>
-            <w:rFonts w:ascii="Cambria Math" w:hAnsi="Cambria Math" w:eastAsia="Cambria Math"/>
-            <w:sz w:val="20"/>
-          </w:rPr>
-          <m:t>5</m:t>
-        </m:r>
-        <m:r>
-          <w:rPr>
-            <w:rFonts w:ascii="Cambria Math" w:hAnsi="Cambria Math" w:eastAsia="Cambria Math"/>
-            <w:sz w:val="20"/>
-          </w:rPr>
-          <m:t>​</m:t>
-        </m:r>
-        <m:r>
-          <m:rPr>
-            <m:sty m:val="p"/>
-          </m:rPr>
-          <w:rPr>
-            <w:rFonts w:ascii="Cambria Math" w:hAnsi="Cambria Math" w:eastAsia="Cambria Math"/>
-            <w:sz w:val="20"/>
-          </w:rPr>
-          <m:t>×</m:t>
-        </m:r>
-        <m:r>
-          <w:rPr>
-            <w:rFonts w:ascii="Cambria Math" w:hAnsi="Cambria Math" w:eastAsia="Cambria Math"/>
-            <w:sz w:val="20"/>
-          </w:rPr>
-          <m:t>​</m:t>
-        </m:r>
-        <m:sSup>
+        <m:sSubSup>
           <m:e>
             <m:r>
               <w:rPr>
                 <w:rFonts w:ascii="Cambria Math" w:hAnsi="Cambria Math" w:eastAsia="Cambria Math"/>
                 <w:sz w:val="20"/>
               </w:rPr>
-              <m:t>10</m:t>
+              <m:t>λ</m:t>
             </m:r>
           </m:e>
+          <m:sub>
+            <m:r>
+              <m:rPr>
+                <m:sty m:val="p"/>
+              </m:rPr>
+              <w:rPr>
+                <w:rFonts w:ascii="Cambria Math" w:hAnsi="Cambria Math" w:eastAsia="Cambria Math"/>
+                <w:sz w:val="20"/>
+              </w:rPr>
+              <m:t>TV</m:t>
+            </m:r>
+          </m:sub>
           <m:sup>
             <m:r>
               <m:rPr>
@@ -3368,17 +3349,10 @@
                 <w:rFonts w:ascii="Cambria Math" w:hAnsi="Cambria Math" w:eastAsia="Cambria Math"/>
                 <w:sz w:val="20"/>
               </w:rPr>
-              <m:t>−</m:t>
-            </m:r>
-            <m:r>
-              <w:rPr>
-                <w:rFonts w:ascii="Cambria Math" w:hAnsi="Cambria Math" w:eastAsia="Cambria Math"/>
-                <w:sz w:val="20"/>
-              </w:rPr>
-              <m:t>7</m:t>
+              <m:t>sup</m:t>
             </m:r>
           </m:sup>
-        </m:sSup>
+        </m:sSubSup>
         <m:r>
           <m:rPr>
             <m:sty m:val="p"/>
@@ -3467,116 +3441,253 @@
         <w:pStyle w:val="IEEEBody"/>
       </w:pPr>
       <w:r>
-        <w:t xml:space="preserve">TV sums the mean absolute horizontal and vertical neighbor differences. AMS masks pixels independently with probability 0.2, forming</w:t>
-      </w:r>
-      <w:r>
-        <w:t xml:space="preserve"> </w:t>
+        <w:t xml:space="preserve">TV is the sum of the mean absolute horizontal and vertical neighbor differences. Both TV weights are selected on their corresponding validation splits as described in Section III-B. AMS masks pixels independently with probability 0.2</w:t>
+      </w:r>
+      <w:r>
+        <w:t xml:space="preserve"> and supervises only masked positions using their original noisy values:</w:t>
+      </w:r>
+    </w:p>
+    <w:p>
+      <w:pPr>
+        <w:pStyle w:val="IEEEEquation"/>
+      </w:pPr>
+      <w:r>
+        <w:tab/>
       </w:r>
       <m:oMath>
-        <m:sSub>
+        <m:eqArr>
+          <m:eqArrPr>
+            <m:baseJc m:val="center"/>
+          </m:eqArrPr>
           <m:e>
+            <m:sSub>
+              <m:e>
+                <m:r>
+                  <m:rPr>
+                    <m:sty m:val="bi"/>
+                  </m:rPr>
+                  <w:rPr>
+                    <w:rFonts w:ascii="Cambria Math" w:hAnsi="Cambria Math" w:eastAsia="Cambria Math"/>
+                    <w:sz w:val="20"/>
+                  </w:rPr>
+                  <m:t>Y</m:t>
+                </m:r>
+              </m:e>
+              <m:sub>
+                <m:r>
+                  <w:rPr>
+                    <w:rFonts w:ascii="Cambria Math" w:hAnsi="Cambria Math" w:eastAsia="Cambria Math"/>
+                    <w:sz w:val="20"/>
+                  </w:rPr>
+                  <m:t>m</m:t>
+                </m:r>
+              </m:sub>
+            </m:sSub>
+            <m:r>
+              <m:rPr>
+                <m:sty m:val="p"/>
+              </m:rPr>
+              <w:rPr>
+                <w:rFonts w:ascii="Cambria Math" w:hAnsi="Cambria Math" w:eastAsia="Cambria Math"/>
+                <w:sz w:val="20"/>
+              </w:rPr>
+              <m:t>=</m:t>
+            </m:r>
             <m:r>
               <m:rPr>
                 <m:sty m:val="bi"/>
               </m:rPr>
               <w:rPr>
                 <w:rFonts w:ascii="Cambria Math" w:hAnsi="Cambria Math" w:eastAsia="Cambria Math"/>
+                <w:sz w:val="20"/>
               </w:rPr>
               <m:t>Y</m:t>
             </m:r>
-          </m:e>
-          <m:sub>
+            <m:r>
+              <m:rPr>
+                <m:sty m:val="p"/>
+              </m:rPr>
+              <w:rPr>
+                <w:rFonts w:ascii="Cambria Math" w:hAnsi="Cambria Math" w:eastAsia="Cambria Math"/>
+                <w:sz w:val="20"/>
+              </w:rPr>
+              <m:t>⊙</m:t>
+            </m:r>
+            <m:r>
+              <m:rPr>
+                <m:sty m:val="p"/>
+              </m:rPr>
+              <w:rPr>
+                <w:rFonts w:ascii="Cambria Math" w:hAnsi="Cambria Math" w:eastAsia="Cambria Math"/>
+                <w:sz w:val="20"/>
+              </w:rPr>
+              <m:t>(</m:t>
+            </m:r>
             <m:r>
               <w:rPr>
                 <w:rFonts w:ascii="Cambria Math" w:hAnsi="Cambria Math" w:eastAsia="Cambria Math"/>
+                <w:sz w:val="20"/>
               </w:rPr>
-              <m:t>m</m:t>
+              <m:t>1</m:t>
             </m:r>
-          </m:sub>
-        </m:sSub>
-        <m:r>
-          <m:rPr>
-            <m:sty m:val="p"/>
-          </m:rPr>
-          <w:rPr>
-            <w:rFonts w:ascii="Cambria Math" w:hAnsi="Cambria Math" w:eastAsia="Cambria Math"/>
-          </w:rPr>
-          <m:t>=</m:t>
-        </m:r>
-        <m:r>
-          <m:rPr>
-            <m:sty m:val="bi"/>
-          </m:rPr>
-          <w:rPr>
-            <w:rFonts w:ascii="Cambria Math" w:hAnsi="Cambria Math" w:eastAsia="Cambria Math"/>
-          </w:rPr>
-          <m:t>Y</m:t>
-        </m:r>
-        <m:r>
-          <m:rPr>
-            <m:sty m:val="p"/>
-          </m:rPr>
-          <w:rPr>
-            <w:rFonts w:ascii="Cambria Math" w:hAnsi="Cambria Math" w:eastAsia="Cambria Math"/>
-          </w:rPr>
-          <m:t>⊙</m:t>
-        </m:r>
-        <m:r>
-          <m:rPr>
-            <m:sty m:val="p"/>
-          </m:rPr>
-          <w:rPr>
-            <w:rFonts w:ascii="Cambria Math" w:hAnsi="Cambria Math" w:eastAsia="Cambria Math"/>
-          </w:rPr>
-          <m:t>(</m:t>
-        </m:r>
-        <m:r>
-          <w:rPr>
-            <w:rFonts w:ascii="Cambria Math" w:hAnsi="Cambria Math" w:eastAsia="Cambria Math"/>
-          </w:rPr>
-          <m:t>1</m:t>
-        </m:r>
-        <m:r>
-          <m:rPr>
-            <m:sty m:val="p"/>
-          </m:rPr>
-          <w:rPr>
-            <w:rFonts w:ascii="Cambria Math" w:hAnsi="Cambria Math" w:eastAsia="Cambria Math"/>
-          </w:rPr>
-          <m:t>−</m:t>
-        </m:r>
-        <m:r>
-          <m:rPr>
-            <m:sty m:val="bi"/>
-          </m:rPr>
-          <w:rPr>
-            <w:rFonts w:ascii="Cambria Math" w:hAnsi="Cambria Math" w:eastAsia="Cambria Math"/>
-          </w:rPr>
-          <m:t>M</m:t>
-        </m:r>
-        <m:r>
-          <m:rPr>
-            <m:sty m:val="p"/>
-          </m:rPr>
-          <w:rPr>
-            <w:rFonts w:ascii="Cambria Math" w:hAnsi="Cambria Math" w:eastAsia="Cambria Math"/>
-          </w:rPr>
-          <m:t>)</m:t>
-        </m:r>
-      </m:oMath>
-      <w:r>
-        <w:t xml:space="preserve">, and supervises only masked positions using their original noisy values:</w:t>
-      </w:r>
-    </w:p>
-    <w:p>
-      <w:pPr>
-        <w:pStyle w:val="IEEEEquation"/>
-      </w:pPr>
-      <w:r>
-        <w:tab/>
-      </w:r>
-      <m:oMath>
-        <m:eqArr>
+            <m:r>
+              <m:rPr>
+                <m:sty m:val="p"/>
+              </m:rPr>
+              <w:rPr>
+                <w:rFonts w:ascii="Cambria Math" w:hAnsi="Cambria Math" w:eastAsia="Cambria Math"/>
+                <w:sz w:val="20"/>
+              </w:rPr>
+              <m:t>−</m:t>
+            </m:r>
+            <m:r>
+              <m:rPr>
+                <m:sty m:val="bi"/>
+              </m:rPr>
+              <w:rPr>
+                <w:rFonts w:ascii="Cambria Math" w:hAnsi="Cambria Math" w:eastAsia="Cambria Math"/>
+                <w:sz w:val="20"/>
+              </w:rPr>
+              <m:t>M</m:t>
+            </m:r>
+            <m:r>
+              <m:rPr>
+                <m:sty m:val="p"/>
+              </m:rPr>
+              <w:rPr>
+                <w:rFonts w:ascii="Cambria Math" w:hAnsi="Cambria Math" w:eastAsia="Cambria Math"/>
+                <w:sz w:val="20"/>
+              </w:rPr>
+              <m:t>)</m:t>
+            </m:r>
+            <m:r>
+              <m:rPr>
+                <m:sty m:val="p"/>
+              </m:rPr>
+              <w:rPr>
+                <w:rFonts w:ascii="Cambria Math" w:hAnsi="Cambria Math" w:eastAsia="Cambria Math"/>
+                <w:sz w:val="20"/>
+              </w:rPr>
+              <m:t>,</m:t>
+            </m:r>
+            <m:r>
+              <m:rPr>
+                <m:sty m:val="p"/>
+                <m:nor/>
+              </m:rPr>
+              <w:rPr>
+                <w:rFonts w:ascii="Cambria Math" w:hAnsi="Cambria Math" w:eastAsia="Cambria Math"/>
+                <w:sz w:val="20"/>
+              </w:rPr>
+              <m:t xml:space="preserve">  </m:t>
+            </m:r>
+            <m:sSub>
+              <m:e>
+                <m:acc>
+                  <m:accPr>
+                    <m:chr m:val="̂"/>
+                  </m:accPr>
+                  <m:e>
+                    <m:r>
+                      <m:rPr>
+                        <m:sty m:val="bi"/>
+                      </m:rPr>
+                      <w:rPr>
+                        <w:rFonts w:ascii="Cambria Math" w:hAnsi="Cambria Math" w:eastAsia="Cambria Math"/>
+                        <w:sz w:val="20"/>
+                      </w:rPr>
+                      <m:t>X</m:t>
+                    </m:r>
+                  </m:e>
+                </m:acc>
+              </m:e>
+              <m:sub>
+                <m:r>
+                  <m:rPr>
+                    <m:sty m:val="i"/>
+                  </m:rPr>
+                  <w:rPr>
+                    <w:rFonts w:ascii="Cambria Math" w:hAnsi="Cambria Math" w:eastAsia="Cambria Math"/>
+                    <w:sz w:val="20"/>
+                  </w:rPr>
+                  <m:t>m</m:t>
+                </m:r>
+              </m:sub>
+            </m:sSub>
+            <m:r>
+              <m:rPr>
+                <m:sty m:val="p"/>
+              </m:rPr>
+              <w:rPr>
+                <w:rFonts w:ascii="Cambria Math" w:hAnsi="Cambria Math" w:eastAsia="Cambria Math"/>
+                <w:sz w:val="20"/>
+              </w:rPr>
+              <m:t>=</m:t>
+            </m:r>
+            <m:sSub>
+              <m:e>
+                <m:r>
+                  <w:rPr>
+                    <w:rFonts w:ascii="Cambria Math" w:hAnsi="Cambria Math" w:eastAsia="Cambria Math"/>
+                    <w:sz w:val="20"/>
+                  </w:rPr>
+                  <m:t>f</m:t>
+                </m:r>
+              </m:e>
+              <m:sub>
+                <m:r>
+                  <w:rPr>
+                    <w:rFonts w:ascii="Cambria Math" w:hAnsi="Cambria Math" w:eastAsia="Cambria Math"/>
+                    <w:sz w:val="20"/>
+                  </w:rPr>
+                  <m:t>θ</m:t>
+                </m:r>
+              </m:sub>
+            </m:sSub>
+            <m:r>
+              <m:rPr>
+                <m:sty m:val="p"/>
+              </m:rPr>
+              <w:rPr>
+                <w:rFonts w:ascii="Cambria Math" w:hAnsi="Cambria Math" w:eastAsia="Cambria Math"/>
+                <w:sz w:val="20"/>
+              </w:rPr>
+              <m:t>(</m:t>
+            </m:r>
+            <m:sSub>
+              <m:e>
+                <m:r>
+                  <m:rPr>
+                    <m:sty m:val="bi"/>
+                  </m:rPr>
+                  <w:rPr>
+                    <w:rFonts w:ascii="Cambria Math" w:hAnsi="Cambria Math" w:eastAsia="Cambria Math"/>
+                    <w:sz w:val="20"/>
+                  </w:rPr>
+                  <m:t>Y</m:t>
+                </m:r>
+              </m:e>
+              <m:sub>
+                <m:r>
+                  <w:rPr>
+                    <w:rFonts w:ascii="Cambria Math" w:hAnsi="Cambria Math" w:eastAsia="Cambria Math"/>
+                    <w:sz w:val="20"/>
+                  </w:rPr>
+                  <m:t>m</m:t>
+                </m:r>
+              </m:sub>
+            </m:sSub>
+            <m:r>
+              <m:rPr>
+                <m:sty m:val="p"/>
+              </m:rPr>
+              <w:rPr>
+                <w:rFonts w:ascii="Cambria Math" w:hAnsi="Cambria Math" w:eastAsia="Cambria Math"/>
+                <w:sz w:val="20"/>
+              </w:rPr>
+              <m:t>),</m:t>
+            </m:r>
+          </m:e>
           <m:e>
             <m:sSub>
               <m:e>
@@ -3589,7 +3700,7 @@
                     <w:rFonts w:ascii="Cambria Math" w:hAnsi="Cambria Math" w:eastAsia="Cambria Math"/>
                     <w:sz w:val="20"/>
                   </w:rPr>
-                  <m:t>L</m:t>
+                  <m:t>ℒ</m:t>
                 </m:r>
               </m:e>
               <m:sub>
@@ -3635,20 +3746,6 @@
               </w:rPr>
               <m:t>=</m:t>
             </m:r>
-            <m:r>
-              <w:rPr>
-                <w:rFonts w:ascii="Cambria Math" w:hAnsi="Cambria Math" w:eastAsia="Cambria Math"/>
-                <w:sz w:val="20"/>
-              </w:rPr>
-              <m:t>​</m:t>
-            </m:r>
-            <m:r>
-              <w:rPr>
-                <w:rFonts w:ascii="Cambria Math" w:hAnsi="Cambria Math" w:eastAsia="Cambria Math"/>
-                <w:sz w:val="20"/>
-              </w:rPr>
-              <m:t>&amp;</m:t>
-            </m:r>
             <m:f>
               <m:fPr>
                 <m:type m:val="bar"/>
@@ -3682,63 +3779,33 @@
                             <w:rFonts w:ascii="Cambria Math" w:hAnsi="Cambria Math" w:eastAsia="Cambria Math"/>
                             <w:sz w:val="20"/>
                           </w:rPr>
-                          <m:t>⊙</m:t>
-                        </m:r>
-                        <m:r>
-                          <m:rPr>
-                            <m:sty m:val="p"/>
-                          </m:rPr>
-                          <w:rPr>
-                            <w:rFonts w:ascii="Cambria Math" w:hAnsi="Cambria Math" w:eastAsia="Cambria Math"/>
-                            <w:sz w:val="20"/>
-                          </w:rPr>
-                          <m:t>[</m:t>
+                          <m:t>⊙(</m:t>
                         </m:r>
                         <m:sSub>
                           <m:e>
-                            <m:r>
-                              <w:rPr>
-                                <w:rFonts w:ascii="Cambria Math" w:hAnsi="Cambria Math" w:eastAsia="Cambria Math"/>
-                                <w:sz w:val="20"/>
-                              </w:rPr>
-                              <m:t>f</m:t>
-                            </m:r>
+                            <m:acc>
+                              <m:accPr>
+                                <m:chr m:val="̂"/>
+                              </m:accPr>
+                              <m:e>
+                                <m:r>
+                                  <m:rPr>
+                                    <m:sty m:val="bi"/>
+                                  </m:rPr>
+                                  <w:rPr>
+                                    <w:rFonts w:ascii="Cambria Math" w:hAnsi="Cambria Math" w:eastAsia="Cambria Math"/>
+                                    <w:sz w:val="20"/>
+                                  </w:rPr>
+                                  <m:t>X</m:t>
+                                </m:r>
+                              </m:e>
+                            </m:acc>
                           </m:e>
                           <m:sub>
                             <m:r>
-                              <w:rPr>
-                                <w:rFonts w:ascii="Cambria Math" w:hAnsi="Cambria Math" w:eastAsia="Cambria Math"/>
-                                <w:sz w:val="20"/>
-                              </w:rPr>
-                              <m:t>θ</m:t>
-                            </m:r>
-                          </m:sub>
-                        </m:sSub>
-                        <m:r>
-                          <m:rPr>
-                            <m:sty m:val="p"/>
-                          </m:rPr>
-                          <w:rPr>
-                            <w:rFonts w:ascii="Cambria Math" w:hAnsi="Cambria Math" w:eastAsia="Cambria Math"/>
-                            <w:sz w:val="20"/>
-                          </w:rPr>
-                          <m:t>(</m:t>
-                        </m:r>
-                        <m:sSub>
-                          <m:e>
-                            <m:r>
                               <m:rPr>
-                                <m:sty m:val="bi"/>
+                                <m:sty m:val="i"/>
                               </m:rPr>
-                              <w:rPr>
-                                <w:rFonts w:ascii="Cambria Math" w:hAnsi="Cambria Math" w:eastAsia="Cambria Math"/>
-                                <w:sz w:val="20"/>
-                              </w:rPr>
-                              <m:t>Y</m:t>
-                            </m:r>
-                          </m:e>
-                          <m:sub>
-                            <m:r>
                               <w:rPr>
                                 <w:rFonts w:ascii="Cambria Math" w:hAnsi="Cambria Math" w:eastAsia="Cambria Math"/>
                                 <w:sz w:val="20"/>
@@ -3747,16 +3814,6 @@
                             </m:r>
                           </m:sub>
                         </m:sSub>
-                        <m:r>
-                          <m:rPr>
-                            <m:sty m:val="p"/>
-                          </m:rPr>
-                          <w:rPr>
-                            <w:rFonts w:ascii="Cambria Math" w:hAnsi="Cambria Math" w:eastAsia="Cambria Math"/>
-                            <w:sz w:val="20"/>
-                          </w:rPr>
-                          <m:t>)</m:t>
-                        </m:r>
                         <m:r>
                           <m:rPr>
                             <m:sty m:val="p"/>
@@ -3785,7 +3842,7 @@
                             <w:rFonts w:ascii="Cambria Math" w:hAnsi="Cambria Math" w:eastAsia="Cambria Math"/>
                             <w:sz w:val="20"/>
                           </w:rPr>
-                          <m:t>]</m:t>
+                          <m:t>)</m:t>
                         </m:r>
                       </m:e>
                     </m:d>
@@ -3805,10 +3862,12 @@
                 <m:r>
                   <m:rPr>
                     <m:sty m:val="p"/>
+                    <m:nor/>
                   </m:rPr>
                   <w:rPr>
                     <w:rFonts w:ascii="Cambria Math" w:hAnsi="Cambria Math" w:eastAsia="Cambria Math"/>
                     <w:sz w:val="20"/>
+                    <w:i w:val="0"/>
                   </w:rPr>
                   <m:t>max</m:t>
                 </m:r>
@@ -3884,15 +3943,6 @@
                 </m:r>
               </m:den>
             </m:f>
-          </m:e>
-          <m:e>
-            <m:r>
-              <w:rPr>
-                <w:rFonts w:ascii="Cambria Math" w:hAnsi="Cambria Math" w:eastAsia="Cambria Math"/>
-                <w:sz w:val="20"/>
-              </w:rPr>
-              <m:t>&amp;</m:t>
-            </m:r>
             <m:r>
               <m:rPr>
                 <m:sty m:val="p"/>
@@ -3903,17 +3953,20 @@
               </w:rPr>
               <m:t>+</m:t>
             </m:r>
-            <m:sSup>
+            <m:sSub>
               <m:e>
                 <m:r>
+                  <m:rPr>
+                    <m:sty m:val="i"/>
+                  </m:rPr>
                   <w:rPr>
                     <w:rFonts w:ascii="Cambria Math" w:hAnsi="Cambria Math" w:eastAsia="Cambria Math"/>
                     <w:sz w:val="20"/>
                   </w:rPr>
-                  <m:t>10</m:t>
+                  <m:t>λ</m:t>
                 </m:r>
               </m:e>
-              <m:sup>
+              <m:sub>
                 <m:r>
                   <m:rPr>
                     <m:sty m:val="p"/>
@@ -3922,54 +3975,7 @@
                     <w:rFonts w:ascii="Cambria Math" w:hAnsi="Cambria Math" w:eastAsia="Cambria Math"/>
                     <w:sz w:val="20"/>
                   </w:rPr>
-                  <m:t>−</m:t>
-                </m:r>
-                <m:r>
-                  <w:rPr>
-                    <w:rFonts w:ascii="Cambria Math" w:hAnsi="Cambria Math" w:eastAsia="Cambria Math"/>
-                    <w:sz w:val="20"/>
-                  </w:rPr>
-                  <m:t>3</m:t>
-                </m:r>
-              </m:sup>
-            </m:sSup>
-            <m:r>
-              <m:rPr>
-                <m:sty m:val="p"/>
-              </m:rPr>
-              <w:rPr>
-                <w:rFonts w:ascii="Cambria Math" w:hAnsi="Cambria Math" w:eastAsia="Cambria Math"/>
-                <w:sz w:val="20"/>
-              </w:rPr>
-              <m:t>TV</m:t>
-            </m:r>
-            <m:r>
-              <m:rPr>
-                <m:sty m:val="p"/>
-              </m:rPr>
-              <w:rPr>
-                <w:rFonts w:ascii="Cambria Math" w:hAnsi="Cambria Math" w:eastAsia="Cambria Math"/>
-                <w:sz w:val="20"/>
-              </w:rPr>
-              <m:t>(</m:t>
-            </m:r>
-            <m:sSub>
-              <m:e>
-                <m:r>
-                  <w:rPr>
-                    <w:rFonts w:ascii="Cambria Math" w:hAnsi="Cambria Math" w:eastAsia="Cambria Math"/>
-                    <w:sz w:val="20"/>
-                  </w:rPr>
-                  <m:t>f</m:t>
-                </m:r>
-              </m:e>
-              <m:sub>
-                <m:r>
-                  <w:rPr>
-                    <w:rFonts w:ascii="Cambria Math" w:hAnsi="Cambria Math" w:eastAsia="Cambria Math"/>
-                    <w:sz w:val="20"/>
-                  </w:rPr>
-                  <m:t>θ</m:t>
+                  <m:t>AMS</m:t>
                 </m:r>
               </m:sub>
             </m:sSub>
@@ -3981,23 +3987,33 @@
                 <w:rFonts w:ascii="Cambria Math" w:hAnsi="Cambria Math" w:eastAsia="Cambria Math"/>
                 <w:sz w:val="20"/>
               </w:rPr>
-              <m:t>(</m:t>
+              <m:t>TV(</m:t>
             </m:r>
             <m:sSub>
               <m:e>
-                <m:r>
-                  <m:rPr>
-                    <m:sty m:val="bi"/>
-                  </m:rPr>
-                  <w:rPr>
-                    <w:rFonts w:ascii="Cambria Math" w:hAnsi="Cambria Math" w:eastAsia="Cambria Math"/>
-                    <w:sz w:val="20"/>
-                  </w:rPr>
-                  <m:t>Y</m:t>
-                </m:r>
+                <m:acc>
+                  <m:accPr>
+                    <m:chr m:val="̂"/>
+                  </m:accPr>
+                  <m:e>
+                    <m:r>
+                      <m:rPr>
+                        <m:sty m:val="bi"/>
+                      </m:rPr>
+                      <w:rPr>
+                        <w:rFonts w:ascii="Cambria Math" w:hAnsi="Cambria Math" w:eastAsia="Cambria Math"/>
+                        <w:sz w:val="20"/>
+                      </w:rPr>
+                      <m:t>X</m:t>
+                    </m:r>
+                  </m:e>
+                </m:acc>
               </m:e>
               <m:sub>
                 <m:r>
+                  <m:rPr>
+                    <m:sty m:val="i"/>
+                  </m:rPr>
                   <w:rPr>
                     <w:rFonts w:ascii="Cambria Math" w:hAnsi="Cambria Math" w:eastAsia="Cambria Math"/>
                     <w:sz w:val="20"/>
@@ -4014,27 +4030,7 @@
                 <w:rFonts w:ascii="Cambria Math" w:hAnsi="Cambria Math" w:eastAsia="Cambria Math"/>
                 <w:sz w:val="20"/>
               </w:rPr>
-              <m:t>)</m:t>
-            </m:r>
-            <m:r>
-              <m:rPr>
-                <m:sty m:val="p"/>
-              </m:rPr>
-              <w:rPr>
-                <w:rFonts w:ascii="Cambria Math" w:hAnsi="Cambria Math" w:eastAsia="Cambria Math"/>
-                <w:sz w:val="20"/>
-              </w:rPr>
-              <m:t>)</m:t>
-            </m:r>
-            <m:r>
-              <m:rPr>
-                <m:sty m:val="p"/>
-              </m:rPr>
-              <w:rPr>
-                <w:rFonts w:ascii="Cambria Math" w:hAnsi="Cambria Math" w:eastAsia="Cambria Math"/>
-                <w:sz w:val="20"/>
-              </w:rPr>
-              <m:t>.</m:t>
+              <m:t>).</m:t>
             </m:r>
           </m:e>
         </m:eqArr>
@@ -4157,14 +4153,6 @@
       </w:r>
       <w:r>
         <w:t xml:space="preserve">throughout the network, including the compensator.</w:t>
-      </w:r>
-    </w:p>
-    <w:p>
-      <w:pPr>
-        <w:pStyle w:val="IEEEBody"/>
-      </w:pPr>
-      <w:r>
-        <w:t xml:space="preserve">Supplementary Figs. S1 and S2 illustrate the refinement and adaptation operations specified above.</w:t>
       </w:r>
     </w:p>
     <w:p>
@@ -4468,7 +4456,75 @@
         </m:sSup>
       </m:oMath>
       <w:r>
-        <w:t xml:space="preserve">, and 100,000 updates. Every 5,000 updates, validation mean squared error (MSE) in intensity is averaged equally by class and look; the lowest value selects the checkpoint. A plateau scheduler halves the rate with patience four validation events and a</w:t>
+        <w:t xml:space="preserve">, and 100,000 updates. Before testing, validation sweeps selected </w:t>
+      </w:r>
+      <m:oMath>
+        <m:sSubSup>
+          <m:e>
+            <m:r>
+              <w:rPr>
+                <w:rFonts w:ascii="Cambria Math" w:hAnsi="Cambria Math" w:eastAsia="Cambria Math"/>
+                <w:sz w:val="20"/>
+              </w:rPr>
+              <m:t>λ</m:t>
+            </m:r>
+          </m:e>
+          <m:sub>
+            <m:r>
+              <m:rPr>
+                <m:sty m:val="p"/>
+              </m:rPr>
+              <w:rPr>
+                <w:rFonts w:ascii="Cambria Math" w:hAnsi="Cambria Math" w:eastAsia="Cambria Math"/>
+                <w:sz w:val="20"/>
+              </w:rPr>
+              <m:t>TV</m:t>
+            </m:r>
+          </m:sub>
+          <m:sup>
+            <m:r>
+              <m:rPr>
+                <m:sty m:val="p"/>
+              </m:rPr>
+              <w:rPr>
+                <w:rFonts w:ascii="Cambria Math" w:hAnsi="Cambria Math" w:eastAsia="Cambria Math"/>
+                <w:sz w:val="20"/>
+              </w:rPr>
+              <m:t>sup</m:t>
+            </m:r>
+          </m:sup>
+        </m:sSubSup>
+      </m:oMath>
+      <w:r>
+        <w:t xml:space="preserve">=3×10⁻² from {0, 10⁻², 3×10⁻², 5×10⁻², 8×10⁻², 10⁻¹} because it gave the highest synthetic macro PSNR/SSIM, and </w:t>
+      </w:r>
+      <m:oMath>
+        <m:sSub>
+          <m:e>
+            <m:r>
+              <w:rPr>
+                <w:rFonts w:ascii="Cambria Math" w:hAnsi="Cambria Math" w:eastAsia="Cambria Math"/>
+                <w:sz w:val="20"/>
+              </w:rPr>
+              <m:t>λ</m:t>
+            </m:r>
+          </m:e>
+          <m:sub>
+            <m:r>
+              <m:rPr>
+                <m:sty m:val="p"/>
+              </m:rPr>
+              <w:rPr>
+                <w:rFonts w:ascii="Cambria Math" w:hAnsi="Cambria Math" w:eastAsia="Cambria Math"/>
+                <w:sz w:val="20"/>
+              </w:rPr>
+              <m:t>AMS</m:t>
+            </m:r>
+          </m:sub>
+        </m:sSub>
+      </m:oMath>
+      <w:r>
+        <w:t xml:space="preserve">=10⁻³ from {0, 10⁻⁴, 10⁻³, 10⁻², 10⁻¹} because it gave the best real-SAR M-index/EPI tradeoff (ENL diagnostic only); both were then fixed. Every 5,000 updates, validation mean squared error (MSE) in intensity is averaged equally by class and look; the lowest value selects the checkpoint. A plateau scheduler halves the rate with patience four validation events and a</w:t>
       </w:r>
       <w:r>
         <w:t xml:space="preserve"> </w:t>

</xml_diff>